<commit_message>
press kit more videos
</commit_message>
<xml_diff>
--- a/press/press-kit/presskit.docx
+++ b/press/press-kit/presskit.docx
@@ -1502,15 +1502,15 @@
             <w:tcW w:type="dxa" w:w="4320"/>
           </w:tcPr>
           <w:p>
-            <w:r>
-              <w:rPr>
-                <w:b w:val="0"/>
-                <w:i w:val="0"/>
-                <w:color w:val="C2185B"/>
-                <w:sz w:val="19"/>
-              </w:rPr>
-              <w:t>Coming soon</w:t>
-            </w:r>
+            <w:hyperlink r:id="rId25">
+              <w:r>
+                <w:rPr>
+                  <w:color w:val="C2410C"/>
+                  <w:u w:val="single"/>
+                </w:rPr>
+                <w:t xml:space="preserve">youtube.com/watch?v=PL9EuF322NU</w:t>
+              </w:r>
+            </w:hyperlink>
           </w:p>
         </w:tc>
       </w:tr>
@@ -1535,15 +1535,15 @@
             <w:tcW w:type="dxa" w:w="4320"/>
           </w:tcPr>
           <w:p>
-            <w:r>
-              <w:rPr>
-                <w:b w:val="0"/>
-                <w:i w:val="0"/>
-                <w:color w:val="C2185B"/>
-                <w:sz w:val="19"/>
-              </w:rPr>
-              <w:t>Coming soon</w:t>
-            </w:r>
+            <w:hyperlink r:id="rId26">
+              <w:r>
+                <w:rPr>
+                  <w:color w:val="C2410C"/>
+                  <w:u w:val="single"/>
+                </w:rPr>
+                <w:t xml:space="preserve">Download from Google Drive</w:t>
+              </w:r>
+            </w:hyperlink>
           </w:p>
         </w:tc>
       </w:tr>
@@ -1568,15 +1568,15 @@
             <w:tcW w:type="dxa" w:w="4320"/>
           </w:tcPr>
           <w:p>
-            <w:r>
-              <w:rPr>
-                <w:b w:val="0"/>
-                <w:i w:val="0"/>
-                <w:color w:val="C2185B"/>
-                <w:sz w:val="19"/>
-              </w:rPr>
-              <w:t>Coming soon</w:t>
-            </w:r>
+            <w:hyperlink r:id="rId27">
+              <w:r>
+                <w:rPr>
+                  <w:color w:val="C2410C"/>
+                  <w:u w:val="single"/>
+                </w:rPr>
+                <w:t xml:space="preserve">Download from Google Drive</w:t>
+              </w:r>
+            </w:hyperlink>
           </w:p>
         </w:tc>
       </w:tr>
@@ -1593,7 +1593,7 @@
           <w:color w:val="1A1A1A"/>
           <w:sz w:val="22"/>
         </w:rPr>
-        <w:t>Vertical cut - 9:16</w:t>
+        <w:t>Vertical cut</w:t>
       </w:r>
     </w:p>
     <w:tbl>
@@ -1627,48 +1627,15 @@
             <w:tcW w:type="dxa" w:w="4320"/>
           </w:tcPr>
           <w:p>
-            <w:r>
-              <w:rPr>
-                <w:b w:val="0"/>
-                <w:i w:val="0"/>
-                <w:color w:val="C2185B"/>
-                <w:sz w:val="19"/>
-              </w:rPr>
-              <w:t>Coming soon</w:t>
-            </w:r>
-          </w:p>
-        </w:tc>
-      </w:tr>
-      <w:tr>
-        <w:tc>
-          <w:tcPr>
-            <w:tcW w:type="dxa" w:w="4320"/>
-          </w:tcPr>
-          <w:p>
-            <w:r>
-              <w:rPr>
-                <w:b/>
-                <w:color w:val="6B6B6B"/>
-                <w:sz w:val="16"/>
-              </w:rPr>
-              <w:t>4K MP4</w:t>
-            </w:r>
-          </w:p>
-        </w:tc>
-        <w:tc>
-          <w:tcPr>
-            <w:tcW w:type="dxa" w:w="4320"/>
-          </w:tcPr>
-          <w:p>
-            <w:r>
-              <w:rPr>
-                <w:b w:val="0"/>
-                <w:i w:val="0"/>
-                <w:color w:val="C2185B"/>
-                <w:sz w:val="19"/>
-              </w:rPr>
-              <w:t>Coming soon</w:t>
-            </w:r>
+            <w:hyperlink r:id="rId28">
+              <w:r>
+                <w:rPr>
+                  <w:color w:val="C2410C"/>
+                  <w:u w:val="single"/>
+                </w:rPr>
+                <w:t xml:space="preserve">youtube.com/shorts/lGVy7Jap5LM</w:t>
+              </w:r>
+            </w:hyperlink>
           </w:p>
         </w:tc>
       </w:tr>
@@ -1693,15 +1660,15 @@
             <w:tcW w:type="dxa" w:w="4320"/>
           </w:tcPr>
           <w:p>
-            <w:r>
-              <w:rPr>
-                <w:b w:val="0"/>
-                <w:i w:val="0"/>
-                <w:color w:val="C2185B"/>
-                <w:sz w:val="19"/>
-              </w:rPr>
-              <w:t>Coming soon</w:t>
-            </w:r>
+            <w:hyperlink r:id="rId29">
+              <w:r>
+                <w:rPr>
+                  <w:color w:val="C2410C"/>
+                  <w:u w:val="single"/>
+                </w:rPr>
+                <w:t xml:space="preserve">Download from Google Drive</w:t>
+              </w:r>
+            </w:hyperlink>
           </w:p>
         </w:tc>
       </w:tr>
@@ -1787,7 +1754,7 @@
         </w:rPr>
         <w:t xml:space="preserve">beltfed-gif1  </w:t>
       </w:r>
-      <w:hyperlink r:id="rId25">
+      <w:hyperlink r:id="rId30">
         <w:r>
           <w:rPr>
             <w:color w:val="C2410C"/>
@@ -1814,7 +1781,7 @@
         </w:rPr>
         <w:t xml:space="preserve">  </w:t>
       </w:r>
-      <w:hyperlink r:id="rId26">
+      <w:hyperlink r:id="rId31">
         <w:r>
           <w:rPr>
             <w:color w:val="C2410C"/>
@@ -1842,7 +1809,7 @@
         </w:rPr>
         <w:t xml:space="preserve">beltfed-gif2  </w:t>
       </w:r>
-      <w:hyperlink r:id="rId27">
+      <w:hyperlink r:id="rId32">
         <w:r>
           <w:rPr>
             <w:color w:val="C2410C"/>
@@ -1869,7 +1836,7 @@
         </w:rPr>
         <w:t xml:space="preserve">  </w:t>
       </w:r>
-      <w:hyperlink r:id="rId28">
+      <w:hyperlink r:id="rId33">
         <w:r>
           <w:rPr>
             <w:color w:val="C2410C"/>
@@ -1897,7 +1864,7 @@
         </w:rPr>
         <w:t xml:space="preserve">beltfed-gif3  </w:t>
       </w:r>
-      <w:hyperlink r:id="rId29">
+      <w:hyperlink r:id="rId34">
         <w:r>
           <w:rPr>
             <w:color w:val="C2410C"/>
@@ -1924,7 +1891,7 @@
         </w:rPr>
         <w:t xml:space="preserve">  </w:t>
       </w:r>
-      <w:hyperlink r:id="rId30">
+      <w:hyperlink r:id="rId35">
         <w:r>
           <w:rPr>
             <w:color w:val="C2410C"/>
@@ -1952,7 +1919,7 @@
         </w:rPr>
         <w:t xml:space="preserve">beltfed-gif4  </w:t>
       </w:r>
-      <w:hyperlink r:id="rId31">
+      <w:hyperlink r:id="rId36">
         <w:r>
           <w:rPr>
             <w:color w:val="C2410C"/>
@@ -1979,7 +1946,7 @@
         </w:rPr>
         <w:t xml:space="preserve">  </w:t>
       </w:r>
-      <w:hyperlink r:id="rId32">
+      <w:hyperlink r:id="rId37">
         <w:r>
           <w:rPr>
             <w:color w:val="C2410C"/>
@@ -2007,7 +1974,7 @@
         </w:rPr>
         <w:t xml:space="preserve">beltfed-gif5  </w:t>
       </w:r>
-      <w:hyperlink r:id="rId33">
+      <w:hyperlink r:id="rId38">
         <w:r>
           <w:rPr>
             <w:color w:val="C2410C"/>
@@ -2034,7 +2001,7 @@
         </w:rPr>
         <w:t xml:space="preserve">  </w:t>
       </w:r>
-      <w:hyperlink r:id="rId34">
+      <w:hyperlink r:id="rId39">
         <w:r>
           <w:rPr>
             <w:color w:val="C2410C"/>
@@ -2204,7 +2171,7 @@
         </w:rPr>
         <w:t xml:space="preserve">Toby went straight into the indie industry after university, and was one of three developers behind the roguelike </w:t>
       </w:r>
-      <w:hyperlink r:id="rId35">
+      <w:hyperlink r:id="rId40">
         <w:r>
           <w:rPr>
             <w:color w:val="C2410C"/>

</xml_diff>